<commit_message>
Update RentWise AI project documentation
</commit_message>
<xml_diff>
--- a/docs/RentWise_AI_Project_Documentation.docx
+++ b/docs/RentWise_AI_Project_Documentation.docx
@@ -267,22 +267,22 @@
       </w:r>
       <w:proofErr w:type="spellEnd"/>
       <w:r>
-        <w:t xml:space="preserve"> application. Improve the dashboard layout with a clean professional design, consistent financial KPI cards, responsive charts, and intuitive navigation. Preserve the existing CSV data loading and calculations.?</w:t>
-      </w:r>
-    </w:p>
-    <w:p>
-      <w:r>
-        <w:t>2. Please create a sample for last three years of property data.? I also requested start and end date selection.</w:t>
-      </w:r>
-    </w:p>
-    <w:p>
-      <w:r>
-        <w:t>3. The date selection only allows 2026 data. Please update it to allow users to select all available date options.?</w:t>
-      </w:r>
-    </w:p>
-    <w:p>
-      <w:r>
-        <w:t>4. I asked for portfolio filters to add or remove properties and show only the selected property data. Later, I clarified: Provide an option to select one or multiple properties from the portfolio filters.?</w:t>
+        <w:t xml:space="preserve"> application. Improve the dashboard layout with a clean professional design, consistent financial KPI cards, responsive charts, and intuitive navigation. Preserve the existing CSV data loading and calculations.</w:t>
+      </w:r>
+    </w:p>
+    <w:p>
+      <w:r>
+        <w:t>2. Please create a sample for last three years of property data. I also requested start and end date selection.</w:t>
+      </w:r>
+    </w:p>
+    <w:p>
+      <w:r>
+        <w:t>3. The date selection only allows 2026 data. Please update it to allow users to select all available date options.</w:t>
+      </w:r>
+    </w:p>
+    <w:p>
+      <w:r>
+        <w:t>4. I asked for portfolio filters to add or remove properties and show only the selected property data. Later, I clarified: Provide an option to select one or multiple properties from the portfolio filters.</w:t>
       </w:r>
     </w:p>
     <w:p>
@@ -335,7 +335,7 @@
     </w:p>
     <w:p>
       <w:r>
-        <w:t>10. I asked to show the comparison in graph format. When it still showed an error, I shared a screenshot and said: It still shows this tab, instead of the actual comparison data.?</w:t>
+        <w:t>10. I asked to show the comparison in graph format. When it still showed an error, I shared a screenshot and said: It still shows this tab, instead of the actual comparison data.</w:t>
       </w:r>
     </w:p>
     <w:p>
@@ -412,9 +412,15 @@
       </w:r>
       <w:proofErr w:type="gramStart"/>
       <w:r>
-        <w:t>max(2 ?</w:t>
+        <w:t>max(</w:t>
       </w:r>
       <w:proofErr w:type="gramEnd"/>
+      <w:r>
+        <w:t xml:space="preserve">2 </w:t>
+      </w:r>
+      <w:r>
+        <w:t>*</w:t>
+      </w:r>
       <w:r>
         <w:t xml:space="preserve"> the median, the median + $500). The rule requires at least four positive expense records for the same property and category within the selected dates. The baseline includes the flagged record. Credits and zero amounts are excluded. This is a review rule, not proof of an error.</w:t>
       </w:r>
@@ -1383,6 +1389,7 @@
   <w:style w:type="character" w:default="1" w:styleId="DefaultParagraphFont">
     <w:name w:val="Default Paragraph Font"/>
     <w:uiPriority w:val="1"/>
+    <w:semiHidden/>
     <w:unhideWhenUsed/>
   </w:style>
   <w:style w:type="table" w:default="1" w:styleId="TableNormal">

</xml_diff>